<commit_message>
Final MLA Works Cited audit Works_Cited_MLA.docx
</commit_message>
<xml_diff>
--- a/Works_Cited_MLA.docx
+++ b/Works_Cited_MLA.docx
@@ -16,6 +16,51 @@
         <w:ind w:hanging="720" w:left="720"/>
       </w:pPr>
       <w:r>
+        <w:t xml:space="preserve">Author photograph of Katherena Vermette. </w:t>
+      </w:r>
+      <w:r>
+        <w:rPr>
+          <w:i/>
+        </w:rPr>
+        <w:t>Penguin Random House</w:t>
+      </w:r>
+      <w:r>
+        <w:t>, www.penguinrandomhouse.com/authors/2186969/katherena-vermette/. Accessed 29 May 2026.</w:t>
+      </w:r>
+    </w:p>
+    <w:p>
+      <w:pPr>
+        <w:spacing w:line="480" w:lineRule="auto" w:after="0"/>
+        <w:ind w:hanging="720" w:left="720"/>
+      </w:pPr>
+      <w:r>
+        <w:t xml:space="preserve">Cover image of </w:t>
+      </w:r>
+      <w:r>
+        <w:rPr>
+          <w:i/>
+        </w:rPr>
+        <w:t>The Strangers</w:t>
+      </w:r>
+      <w:r>
+        <w:t xml:space="preserve">. </w:t>
+      </w:r>
+      <w:r>
+        <w:rPr>
+          <w:i/>
+        </w:rPr>
+        <w:t>Penguin Random House</w:t>
+      </w:r>
+      <w:r>
+        <w:t>, images.penguinrandomhouse.com/cover/9780735239630. Accessed 29 May 2026.</w:t>
+      </w:r>
+    </w:p>
+    <w:p>
+      <w:pPr>
+        <w:spacing w:line="480" w:lineRule="auto" w:after="0"/>
+        <w:ind w:hanging="720" w:left="720"/>
+      </w:pPr>
+      <w:r>
         <w:t xml:space="preserve">Hanson, Erin. "Sixties Scoop." </w:t>
       </w:r>
       <w:r>
@@ -26,6 +71,24 @@
       </w:r>
       <w:r>
         <w:t>, University of British Columbia, indigenousfoundations.arts.ubc.ca/sixties_scoop/. Accessed 29 May 2026.</w:t>
+      </w:r>
+    </w:p>
+    <w:p>
+      <w:pPr>
+        <w:spacing w:line="480" w:lineRule="auto" w:after="0"/>
+        <w:ind w:hanging="720" w:left="720"/>
+      </w:pPr>
+      <w:r>
+        <w:t xml:space="preserve">Hargrove, Jason. "Red Dress MMIW - Missing and Murdered Indigenous Women." </w:t>
+      </w:r>
+      <w:r>
+        <w:rPr>
+          <w:i/>
+        </w:rPr>
+        <w:t>Wikimedia Commons</w:t>
+      </w:r>
+      <w:r>
+        <w:t>, 30 May 2020, commons.wikimedia.org/wiki/File:Red_Dress_MMIW_-_Missing_and_murdered_Indigenous_women_-_The_Mohawk_Warrior_Flag,_designed_by_Louis_Karoniaktajeh_Hall_-_Justice_For_Regis_-_Not_Another_Black_Life_rally_and_March_-_May_30,_2020.jpg. Accessed 29 May 2026.</w:t>
       </w:r>
     </w:p>
     <w:p>
@@ -188,69 +251,6 @@
       </w:r>
       <w:r>
         <w:t>, vol. 8, no. 4, 2006, pp. 387-409.</w:t>
-      </w:r>
-    </w:p>
-    <w:p>
-      <w:pPr>
-        <w:spacing w:line="480" w:lineRule="auto" w:after="0"/>
-        <w:ind w:hanging="720" w:left="720"/>
-      </w:pPr>
-      <w:r>
-        <w:t xml:space="preserve">Author photograph of katherena vermette. </w:t>
-      </w:r>
-      <w:r>
-        <w:rPr>
-          <w:i/>
-        </w:rPr>
-        <w:t>Penguin Random House</w:t>
-      </w:r>
-      <w:r>
-        <w:t>, www.penguinrandomhouse.com/authors/2186969/katherena-vermette/. Accessed 29 May 2026.</w:t>
-      </w:r>
-    </w:p>
-    <w:p>
-      <w:pPr>
-        <w:spacing w:line="480" w:lineRule="auto" w:after="0"/>
-        <w:ind w:hanging="720" w:left="720"/>
-      </w:pPr>
-      <w:r>
-        <w:t xml:space="preserve">Cover image of </w:t>
-      </w:r>
-      <w:r>
-        <w:rPr>
-          <w:i/>
-        </w:rPr>
-        <w:t>The Strangers</w:t>
-      </w:r>
-      <w:r>
-        <w:t xml:space="preserve">. </w:t>
-      </w:r>
-      <w:r>
-        <w:rPr>
-          <w:i/>
-        </w:rPr>
-        <w:t>Penguin Random House</w:t>
-      </w:r>
-      <w:r>
-        <w:t>, images.penguinrandomhouse.com/cover/9780735239630. Accessed 29 May 2026.</w:t>
-      </w:r>
-    </w:p>
-    <w:p>
-      <w:pPr>
-        <w:spacing w:line="480" w:lineRule="auto" w:after="0"/>
-        <w:ind w:hanging="720" w:left="720"/>
-      </w:pPr>
-      <w:r>
-        <w:t xml:space="preserve">Hargrove, Jason. "Red Dress MMIW - Missing and Murdered Indigenous Women." </w:t>
-      </w:r>
-      <w:r>
-        <w:rPr>
-          <w:i/>
-        </w:rPr>
-        <w:t>Wikimedia Commons</w:t>
-      </w:r>
-      <w:r>
-        <w:t>, 30 May 2020, commons.wikimedia.org/wiki/File:Red_Dress_MMIW_-_Missing_and_murdered_Indigenous_women_-_The_Mohawk_Warrior_Flag,_designed_by_Louis_Karoniaktajeh_Hall_-_Justice_For_Regis_-_Not_Another_Black_Life_rally_and_March_-_May_30,_2020.jpg. Accessed 29 May 2026.</w:t>
       </w:r>
     </w:p>
     <w:sectPr>

</xml_diff>

<commit_message>
Final Works Cited typography cleanup Works_Cited_MLA.docx
</commit_message>
<xml_diff>
--- a/Works_Cited_MLA.docx
+++ b/Works_Cited_MLA.docx
@@ -16,6 +16,9 @@
         <w:ind w:hanging="720" w:left="720"/>
       </w:pPr>
       <w:r>
+        <w:rPr>
+          <w:i w:val="0"/>
+        </w:rPr>
         <w:t xml:space="preserve">Author photograph of Katherena Vermette. </w:t>
       </w:r>
       <w:r>
@@ -25,6 +28,9 @@
         <w:t>Penguin Random House</w:t>
       </w:r>
       <w:r>
+        <w:rPr>
+          <w:i w:val="0"/>
+        </w:rPr>
         <w:t>, www.penguinrandomhouse.com/authors/2186969/katherena-vermette/. Accessed 29 May 2026.</w:t>
       </w:r>
     </w:p>
@@ -34,6 +40,9 @@
         <w:ind w:hanging="720" w:left="720"/>
       </w:pPr>
       <w:r>
+        <w:rPr>
+          <w:i w:val="0"/>
+        </w:rPr>
         <w:t xml:space="preserve">Cover image of </w:t>
       </w:r>
       <w:r>
@@ -43,6 +52,9 @@
         <w:t>The Strangers</w:t>
       </w:r>
       <w:r>
+        <w:rPr>
+          <w:i w:val="0"/>
+        </w:rPr>
         <w:t xml:space="preserve">. </w:t>
       </w:r>
       <w:r>
@@ -52,6 +64,9 @@
         <w:t>Penguin Random House</w:t>
       </w:r>
       <w:r>
+        <w:rPr>
+          <w:i w:val="0"/>
+        </w:rPr>
         <w:t>, images.penguinrandomhouse.com/cover/9780735239630. Accessed 29 May 2026.</w:t>
       </w:r>
     </w:p>
@@ -61,6 +76,9 @@
         <w:ind w:hanging="720" w:left="720"/>
       </w:pPr>
       <w:r>
+        <w:rPr>
+          <w:i w:val="0"/>
+        </w:rPr>
         <w:t xml:space="preserve">Hanson, Erin. "Sixties Scoop." </w:t>
       </w:r>
       <w:r>
@@ -70,6 +88,9 @@
         <w:t>Indigenous Foundations</w:t>
       </w:r>
       <w:r>
+        <w:rPr>
+          <w:i w:val="0"/>
+        </w:rPr>
         <w:t>, University of British Columbia, indigenousfoundations.arts.ubc.ca/sixties_scoop/. Accessed 29 May 2026.</w:t>
       </w:r>
     </w:p>
@@ -79,6 +100,9 @@
         <w:ind w:hanging="720" w:left="720"/>
       </w:pPr>
       <w:r>
+        <w:rPr>
+          <w:i w:val="0"/>
+        </w:rPr>
         <w:t xml:space="preserve">Hargrove, Jason. "Red Dress MMIW - Missing and Murdered Indigenous Women." </w:t>
       </w:r>
       <w:r>
@@ -88,6 +112,9 @@
         <w:t>Wikimedia Commons</w:t>
       </w:r>
       <w:r>
+        <w:rPr>
+          <w:i w:val="0"/>
+        </w:rPr>
         <w:t>, 30 May 2020, commons.wikimedia.org/wiki/File:Red_Dress_MMIW_-_Missing_and_murdered_Indigenous_women_-_The_Mohawk_Warrior_Flag,_designed_by_Louis_Karoniaktajeh_Hall_-_Justice_For_Regis_-_Not_Another_Black_Life_rally_and_March_-_May_30,_2020.jpg. Accessed 29 May 2026.</w:t>
       </w:r>
     </w:p>
@@ -97,6 +124,9 @@
         <w:ind w:hanging="720" w:left="720"/>
       </w:pPr>
       <w:r>
+        <w:rPr>
+          <w:i w:val="0"/>
+        </w:rPr>
         <w:t xml:space="preserve">LaRocque, Emma. </w:t>
       </w:r>
       <w:r>
@@ -106,6 +136,9 @@
         <w:t>When the Other Is Me: Native Resistance Discourse, 1850-1990</w:t>
       </w:r>
       <w:r>
+        <w:rPr>
+          <w:i w:val="0"/>
+        </w:rPr>
         <w:t>. University of Manitoba Press, 2010.</w:t>
       </w:r>
     </w:p>
@@ -115,6 +148,9 @@
         <w:ind w:hanging="720" w:left="720"/>
       </w:pPr>
       <w:r>
+        <w:rPr>
+          <w:i w:val="0"/>
+        </w:rPr>
         <w:t xml:space="preserve">National Inquiry into Missing and Murdered Indigenous Women and Girls. "Final Report." </w:t>
       </w:r>
       <w:r>
@@ -124,6 +160,9 @@
         <w:t>MMIWG</w:t>
       </w:r>
       <w:r>
+        <w:rPr>
+          <w:i w:val="0"/>
+        </w:rPr>
         <w:t>, mmiwg-ffada.ca/final-report/. Accessed 29 May 2026.</w:t>
       </w:r>
     </w:p>
@@ -134,12 +173,9 @@
       </w:pPr>
       <w:r>
         <w:rPr>
-          <w:i/>
+          <w:i w:val="0"/>
         </w:rPr>
-        <w:t>Penguin Random House</w:t>
-      </w:r>
-      <w:r>
-        <w:t xml:space="preserve">. "Katherena Vermette." </w:t>
+        <w:t xml:space="preserve">Penguin Random House. "Katherena Vermette." </w:t>
       </w:r>
       <w:r>
         <w:rPr>
@@ -148,6 +184,9 @@
         <w:t>Penguin Random House</w:t>
       </w:r>
       <w:r>
+        <w:rPr>
+          <w:i w:val="0"/>
+        </w:rPr>
         <w:t>, www.penguinrandomhouse.com/authors/2186969/katherena-vermette/. Accessed 29 May 2026.</w:t>
       </w:r>
     </w:p>
@@ -158,21 +197,9 @@
       </w:pPr>
       <w:r>
         <w:rPr>
-          <w:i/>
+          <w:i w:val="0"/>
         </w:rPr>
-        <w:t>Penguin Random House Canada</w:t>
-      </w:r>
-      <w:r>
-        <w:t>. "</w:t>
-      </w:r>
-      <w:r>
-        <w:rPr>
-          <w:i/>
-        </w:rPr>
-        <w:t>The Strangers</w:t>
-      </w:r>
-      <w:r>
-        <w:t xml:space="preserve"> by Katherena Vermette." </w:t>
+        <w:t xml:space="preserve">Penguin Random House Canada. "The Strangers by Katherena Vermette." </w:t>
       </w:r>
       <w:r>
         <w:rPr>
@@ -181,6 +208,9 @@
         <w:t>Penguin Random House Canada</w:t>
       </w:r>
       <w:r>
+        <w:rPr>
+          <w:i w:val="0"/>
+        </w:rPr>
         <w:t>, www.penguinrandomhouse.ca/books/624145/the-strangers-by-katherena-vermette/9780735239630. Accessed 29 May 2026.</w:t>
       </w:r>
     </w:p>
@@ -190,6 +220,9 @@
         <w:ind w:hanging="720" w:left="720"/>
       </w:pPr>
       <w:r>
+        <w:rPr>
+          <w:i w:val="0"/>
+        </w:rPr>
         <w:t xml:space="preserve">Sinclair, Raven. "Identity Lost and Found: Lessons from the Sixties Scoop." </w:t>
       </w:r>
       <w:r>
@@ -199,6 +232,9 @@
         <w:t>First Peoples Child &amp; Family Review</w:t>
       </w:r>
       <w:r>
+        <w:rPr>
+          <w:i w:val="0"/>
+        </w:rPr>
         <w:t>, vol. 3, no. 1, 2007, pp. 65-82.</w:t>
       </w:r>
     </w:p>
@@ -214,6 +250,9 @@
         <w:t>This River</w:t>
       </w:r>
       <w:r>
+        <w:rPr>
+          <w:i w:val="0"/>
+        </w:rPr>
         <w:t>. Directed by Erika MacPherson and Katherena Vermette, National Film Board of Canada, 2016, collection.nfb.ca/film/this_river/. Accessed 29 May 2026.</w:t>
       </w:r>
     </w:p>
@@ -223,6 +262,9 @@
         <w:ind w:hanging="720" w:left="720"/>
       </w:pPr>
       <w:r>
+        <w:rPr>
+          <w:i w:val="0"/>
+        </w:rPr>
         <w:t xml:space="preserve">Vermette, Katherena. </w:t>
       </w:r>
       <w:r>
@@ -232,6 +274,9 @@
         <w:t>The Strangers</w:t>
       </w:r>
       <w:r>
+        <w:rPr>
+          <w:i w:val="0"/>
+        </w:rPr>
         <w:t>. Hamish Hamilton, 2021.</w:t>
       </w:r>
     </w:p>
@@ -241,6 +286,9 @@
         <w:ind w:hanging="720" w:left="720"/>
       </w:pPr>
       <w:r>
+        <w:rPr>
+          <w:i w:val="0"/>
+        </w:rPr>
         <w:t xml:space="preserve">Wolfe, Patrick. "Settler Colonialism and the Elimination of the Native." </w:t>
       </w:r>
       <w:r>
@@ -250,6 +298,9 @@
         <w:t>Journal of Genocide Research</w:t>
       </w:r>
       <w:r>
+        <w:rPr>
+          <w:i w:val="0"/>
+        </w:rPr>
         <w:t>, vol. 8, no. 4, 2006, pp. 387-409.</w:t>
       </w:r>
     </w:p>

</xml_diff>